<commit_message>
Review fixes: reverse-arb comparison, season labels, interview notes
Co-Authored-By: Claude Opus 5.5 <noreply@anthropic.com>
</commit_message>
<xml_diff>
--- a/docs/Dashboard_Guide.docx
+++ b/docs/Dashboard_Guide.docx
@@ -1619,6 +1619,36 @@
                 <w:b w:val="0"/>
                 <w:sz w:val="18"/>
               </w:rPr>
+              <w:t>Return excluding avoided funding</w:t>
+            </w:r>
+          </w:p>
+        </w:tc>
+        <w:tc>
+          <w:tcPr>
+            <w:tcW w:type="dxa" w:w="4819"/>
+          </w:tcPr>
+          <w:p>
+            <w:r>
+              <w:rPr>
+                <w:b w:val="0"/>
+                <w:sz w:val="18"/>
+              </w:rPr>
+              <w:t>Reverse-arb return with the interest saved left out. This is the reverse-arb figure compared with the T-bill, because the interest saved is itself earned at about the T-bill rate.</w:t>
+            </w:r>
+          </w:p>
+        </w:tc>
+      </w:tr>
+      <w:tr>
+        <w:tc>
+          <w:tcPr>
+            <w:tcW w:type="dxa" w:w="4819"/>
+          </w:tcPr>
+          <w:p>
+            <w:r>
+              <w:rPr>
+                <w:b w:val="0"/>
+                <w:sz w:val="18"/>
+              </w:rPr>
               <w:t>Short-dated</w:t>
             </w:r>
           </w:p>
@@ -3510,7 +3540,7 @@
       <w:r>
         <w:drawing>
           <wp:inline xmlns:a="http://schemas.openxmlformats.org/drawingml/2006/main" xmlns:pic="http://schemas.openxmlformats.org/drawingml/2006/picture">
-            <wp:extent cx="6120000" cy="5712383"/>
+            <wp:extent cx="6120000" cy="5873133"/>
             <wp:docPr id="3" name="Picture 3"/>
             <wp:cNvGraphicFramePr>
               <a:graphicFrameLocks noChangeAspect="1"/>
@@ -3531,7 +3561,7 @@
                   <pic:spPr>
                     <a:xfrm>
                       <a:off x="0" y="0"/>
-                      <a:ext cx="6120000" cy="5712383"/>
+                      <a:ext cx="6120000" cy="5873133"/>
                     </a:xfrm>
                     <a:prstGeom prst="rect"/>
                   </pic:spPr>
@@ -3555,7 +3585,7 @@
       <w:r>
         <w:drawing>
           <wp:inline xmlns:a="http://schemas.openxmlformats.org/drawingml/2006/main" xmlns:pic="http://schemas.openxmlformats.org/drawingml/2006/picture">
-            <wp:extent cx="6120000" cy="5712383"/>
+            <wp:extent cx="6120000" cy="5873133"/>
             <wp:docPr id="4" name="Picture 4"/>
             <wp:cNvGraphicFramePr>
               <a:graphicFrameLocks noChangeAspect="1"/>
@@ -3576,7 +3606,7 @@
                   <pic:spPr>
                     <a:xfrm>
                       <a:off x="0" y="0"/>
-                      <a:ext cx="6120000" cy="5712383"/>
+                      <a:ext cx="6120000" cy="5873133"/>
                     </a:xfrm>
                     <a:prstGeom prst="rect"/>
                   </pic:spPr>
@@ -3600,7 +3630,7 @@
       <w:r>
         <w:drawing>
           <wp:inline xmlns:a="http://schemas.openxmlformats.org/drawingml/2006/main" xmlns:pic="http://schemas.openxmlformats.org/drawingml/2006/picture">
-            <wp:extent cx="6120000" cy="5706642"/>
+            <wp:extent cx="6120000" cy="5867392"/>
             <wp:docPr id="5" name="Picture 5"/>
             <wp:cNvGraphicFramePr>
               <a:graphicFrameLocks noChangeAspect="1"/>
@@ -3621,7 +3651,7 @@
                   <pic:spPr>
                     <a:xfrm>
                       <a:off x="0" y="0"/>
-                      <a:ext cx="6120000" cy="5706642"/>
+                      <a:ext cx="6120000" cy="5867392"/>
                     </a:xfrm>
                     <a:prstGeom prst="rect"/>
                   </pic:spPr>
@@ -3701,7 +3731,24 @@
         <w:pStyle w:val="ListBullet2"/>
       </w:pPr>
       <w:r>
-        <w:t>Reverse arb: price gap = spot - futures. Add the funding and storage avoided. Subtract exchange fee, SEBI fee, brokerage, GST on fees and stamp duty. That gives net benefit.</w:t>
+        <w:t>Reverse arb: price gap = spot - futures. Add the funding and storage avoided. Subtract exchange fee, SEBI fee, brokerage, GST on fees and stamp duty. That gives net benefit. Holding-period and annualised return are worked out the same way.</w:t>
+      </w:r>
+    </w:p>
+    <w:p>
+      <w:pPr>
+        <w:pStyle w:val="ListBullet2"/>
+      </w:pPr>
+      <w:r>
+        <w:t xml:space="preserve">Reverse arb against the T-bill: the calculator also shows the return </w:t>
+      </w:r>
+      <w:r>
+        <w:rPr>
+          <w:b/>
+        </w:rPr>
+        <w:t>excluding avoided funding</w:t>
+      </w:r>
+      <w:r>
+        <w:t xml:space="preserve"> and compares that with the T-bill. The avoided funding is interest on the cash, earned at T-bill plus the spread. Comparing the full return with the T-bill would count that interest twice.</w:t>
       </w:r>
     </w:p>
     <w:p>
@@ -3905,7 +3952,7 @@
         <w:t>How calculated:</w:t>
       </w:r>
       <w:r>
-        <w:t xml:space="preserve"> Net Rs/qtl is profit after every cost including funding. Holding % and Annualised % are before funding for cash-and-carry. "Over T-bill" is annualised minus the T-bill. "Settled at" and "Settled vs 3-day spot" show how the contract actually ended.</w:t>
+        <w:t xml:space="preserve"> Net Rs/qtl is profit after every cost including funding. Holding % and Annualised % are before funding for cash-and-carry, and "Over T-bill" is annualised minus the T-bill. The reverse-arb table has two extra columns in its place: "Annualised % excl. avoided funding" and "Ex-funding vs T-bill". "Settled at" and "Settled vs 3-day spot" show how the contract actually ended.</w:t>
       </w:r>
     </w:p>
     <w:p>
@@ -3919,7 +3966,7 @@
         <w:t>What you can infer (jeera):</w:t>
       </w:r>
       <w:r>
-        <w:t xml:space="preserve"> best cash-and-carry was 28 Nov 2025: 81.16% annualised, Rs 909.54 per quintal, 21 days to expiry. Best reverse arb was 4 Jun 2026: 83.68% annualised, Rs 671.11 per quintal, 15 days.</w:t>
+        <w:t xml:space="preserve"> best cash-and-carry was 28 Nov 2025: 81.16% annualised, Rs 909.54 per quintal, 21 days to expiry, 75.82 points over the T-bill. Best reverse arb was 4 Jun 2026: 83.68% annualised, Rs 671.11 per quintal, 15 days; excluding avoided funding it was 77.20%, which is 71.72 points over the T-bill.</w:t>
       </w:r>
     </w:p>
     <w:p>
@@ -3933,7 +3980,7 @@
         <w:t>Caveats:</w:t>
       </w:r>
       <w:r>
-        <w:t xml:space="preserve"> these are the ten best days of a year, not a typical day. The median tradeable day earned about 16% (cash-and-carry) and 26% (reverse) annualised.</w:t>
+        <w:t xml:space="preserve"> these are the ten best days of a year, not a typical day. The median tradeable day earned about 16% (cash-and-carry) and 26% (reverse, or 19% excluding avoided funding) annualised.</w:t>
       </w:r>
     </w:p>
     <w:p>
@@ -3983,7 +4030,7 @@
         <w:t>Inputs:</w:t>
       </w:r>
       <w:r>
-        <w:t xml:space="preserve"> the top 10 list, the 5-day spot move before each date, days to expiry, and the crop's arrival months.</w:t>
+        <w:t xml:space="preserve"> the top 10 list, the 5-day spot move before each date, days to expiry, and the crop's typical arrival season (general market knowledge, not from exchange data).</w:t>
       </w:r>
     </w:p>
     <w:p>
@@ -4025,7 +4072,7 @@
         <w:t>Caveats:</w:t>
       </w:r>
       <w:r>
-        <w:t xml:space="preserve"> it describes what happened alongside the peaks; it does not prove cause. Arrival months are general market knowledge, not from a cited source.</w:t>
+        <w:t xml:space="preserve"> it reports what was true on the best days; it does not claim a cause. The count of days in the arrival season uses the typical arrival season (general market knowledge, not from exchange data).</w:t>
       </w:r>
     </w:p>
     <w:p>
@@ -4039,7 +4086,7 @@
         <w:t>Likely question:</w:t>
       </w:r>
       <w:r>
-        <w:t xml:space="preserve"> "What drove the best cash-and-carry days?" Futures ran ahead of spot in a rising market in late 2025, about three to four weeks before expiry.</w:t>
+        <w:t xml:space="preserve"> "What drove the best cash-and-carry days?" The data shows what they had in common, not why: they came in late 2025, about three to four weeks before expiry, after spot had risen and futures had risen more. I would not claim a cause from one year.</w:t>
       </w:r>
     </w:p>
     <w:p>
@@ -4412,7 +4459,7 @@
       <w:r>
         <w:drawing>
           <wp:inline xmlns:a="http://schemas.openxmlformats.org/drawingml/2006/main" xmlns:pic="http://schemas.openxmlformats.org/drawingml/2006/picture">
-            <wp:extent cx="6120000" cy="6803189"/>
+            <wp:extent cx="6120000" cy="6877824"/>
             <wp:docPr id="8" name="Picture 8"/>
             <wp:cNvGraphicFramePr>
               <a:graphicFrameLocks noChangeAspect="1"/>
@@ -4433,7 +4480,7 @@
                   <pic:spPr>
                     <a:xfrm>
                       <a:off x="0" y="0"/>
-                      <a:ext cx="6120000" cy="6803189"/>
+                      <a:ext cx="6120000" cy="6877824"/>
                     </a:xfrm>
                     <a:prstGeom prst="rect"/>
                   </pic:spPr>
@@ -4457,7 +4504,7 @@
       <w:r>
         <w:drawing>
           <wp:inline xmlns:a="http://schemas.openxmlformats.org/drawingml/2006/main" xmlns:pic="http://schemas.openxmlformats.org/drawingml/2006/picture">
-            <wp:extent cx="6120000" cy="6803189"/>
+            <wp:extent cx="6120000" cy="6877824"/>
             <wp:docPr id="9" name="Picture 9"/>
             <wp:cNvGraphicFramePr>
               <a:graphicFrameLocks noChangeAspect="1"/>
@@ -4478,7 +4525,7 @@
                   <pic:spPr>
                     <a:xfrm>
                       <a:off x="0" y="0"/>
-                      <a:ext cx="6120000" cy="6803189"/>
+                      <a:ext cx="6120000" cy="6877824"/>
                     </a:xfrm>
                     <a:prstGeom prst="rect"/>
                   </pic:spPr>
@@ -4639,7 +4686,16 @@
         <w:t>What it shows:</w:t>
       </w:r>
       <w:r>
-        <w:t xml:space="preserve"> the same chart for a stock holder selling spot and buying futures.</w:t>
+        <w:t xml:space="preserve"> the same chart for a stock holder selling spot and buying futures. Because it sits beside the T-bill line, the line drawn is the return </w:t>
+      </w:r>
+      <w:r>
+        <w:rPr>
+          <w:b/>
+        </w:rPr>
+        <w:t>excluding avoided funding</w:t>
+      </w:r>
+      <w:r>
+        <w:t>.</w:t>
       </w:r>
     </w:p>
     <w:p>
@@ -4654,6 +4710,16 @@
       </w:r>
       <w:r>
         <w:t xml:space="preserve"> </w:t>
+      </w:r>
+      <w:r>
+        <w:rPr>
+          <w:rFonts w:ascii="Consolas" w:hAnsi="Consolas"/>
+          <w:sz w:val="19"/>
+        </w:rPr>
+        <w:t>rev_return_ex_funding_pct</w:t>
+      </w:r>
+      <w:r>
+        <w:t xml:space="preserve">, </w:t>
       </w:r>
       <w:r>
         <w:rPr>
@@ -4687,7 +4753,7 @@
         <w:t>How calculated:</w:t>
       </w:r>
       <w:r>
-        <w:t xml:space="preserve"> (spot - futures + avoided funding + avoided storage - transaction costs) / spot x 365 / days.</w:t>
+        <w:t xml:space="preserve"> full return = (spot - futures + avoided funding + avoided storage - transaction costs) / spot x 365 / days. The line drawn leaves out the avoided funding.</w:t>
       </w:r>
     </w:p>
     <w:p>
@@ -4701,7 +4767,7 @@
         <w:t>What you can infer:</w:t>
       </w:r>
       <w:r>
-        <w:t xml:space="preserve"> jeera reverse arb was tradeable on 108 days with a median gain of 25.76% a year. Guar seed: 157 days.</w:t>
+        <w:t xml:space="preserve"> jeera reverse arb was tradeable on 108 days. The median gain was 25.76% a year including interest saved and 19.39% excluding it. Guar seed: 157 days, 20.52% and 14.08%.</w:t>
       </w:r>
     </w:p>
     <w:p>
@@ -4715,7 +4781,7 @@
         <w:t>Caveats:</w:t>
       </w:r>
       <w:r>
-        <w:t xml:space="preserve"> only available to someone holding stock. The gain includes costs avoided, not just cash received.</w:t>
+        <w:t xml:space="preserve"> only available to someone holding stock. The interest saved is earned at about the T-bill rate, so it is left out of the T-bill comparison to avoid counting it twice.</w:t>
       </w:r>
     </w:p>
     <w:p>
@@ -5496,7 +5562,7 @@
         <w:t>What you can infer:</w:t>
       </w:r>
       <w:r>
-        <w:t xml:space="preserve"> jeera's curve was steepest in September 2026 (2.21% a month) and flattest in March 2026 (0.09%), when the new crop arrives.</w:t>
+        <w:t xml:space="preserve"> jeera's curve was steepest in September 2026 (2.21% a month) and flattest in March 2026 (0.09%). March falls in jeera's typical arrival season (general market knowledge, not from exchange data).</w:t>
       </w:r>
     </w:p>
     <w:p>
@@ -5510,7 +5576,7 @@
         <w:t>Caveats:</w:t>
       </w:r>
       <w:r>
-        <w:t xml:space="preserve"> one year is one crop cycle. This is a pattern to test, not a rule.</w:t>
+        <w:t xml:space="preserve"> one year is one crop cycle. The chart shows when the slope changed, not why.</w:t>
       </w:r>
     </w:p>
     <w:p>
@@ -5524,7 +5590,7 @@
         <w:t>Likely question:</w:t>
       </w:r>
       <w:r>
-        <w:t xml:space="preserve"> "Is that seasonality?" It is consistent with harvest arrivals flattening the curve, but one cycle cannot prove it.</w:t>
+        <w:t xml:space="preserve"> "Is that seasonality?" It may be. The flattest month falls in the typical arrival season, but that is an observation from one cycle, and the arrival months are general market knowledge, not exchange data. I would need several years to call it seasonal.</w:t>
       </w:r>
     </w:p>
     <w:p>
@@ -7891,6 +7957,32 @@
       </w:r>
       <w:r>
         <w:t>.</w:t>
+      </w:r>
+    </w:p>
+    <w:p>
+      <w:pPr>
+        <w:pStyle w:val="ListBullet"/>
+      </w:pPr>
+      <w:r>
+        <w:t xml:space="preserve">Against the T-bill: leave out the avoided funding. (671.11 - 51.97) / 19,515.65 = 3.17% over 15 days, or </w:t>
+      </w:r>
+      <w:r>
+        <w:rPr>
+          <w:b/>
+        </w:rPr>
+        <w:t>77.20%</w:t>
+      </w:r>
+      <w:r>
+        <w:t xml:space="preserve"> a year, which is </w:t>
+      </w:r>
+      <w:r>
+        <w:rPr>
+          <w:b/>
+        </w:rPr>
+        <w:t>71.72 points</w:t>
+      </w:r>
+      <w:r>
+        <w:t xml:space="preserve"> above the 5.48% T-bill. The Rs 51.97 is interest on the cash, earned at about the T-bill rate, so including it and then subtracting the T-bill would count it twice.</w:t>
       </w:r>
     </w:p>
     <w:p>

</xml_diff>

<commit_message>
Define basis as spot minus futures throughout
Co-Authored-By: Claude Opus 5.5 <noreply@anthropic.com>
</commit_message>
<xml_diff>
--- a/docs/Dashboard_Guide.docx
+++ b/docs/Dashboard_Guide.docx
@@ -1273,7 +1273,37 @@
                 <w:b w:val="0"/>
                 <w:sz w:val="18"/>
               </w:rPr>
-              <w:t>Futures minus spot. In Rs per quintal, or as a % of spot.</w:t>
+              <w:t>Spot minus futures, in Rs per quintal or as a % of spot. Negative when futures are above spot (the cash-and-carry side); positive when futures are below spot (the reverse-arb side).</w:t>
+            </w:r>
+          </w:p>
+        </w:tc>
+      </w:tr>
+      <w:tr>
+        <w:tc>
+          <w:tcPr>
+            <w:tcW w:type="dxa" w:w="4819"/>
+          </w:tcPr>
+          <w:p>
+            <w:r>
+              <w:rPr>
+                <w:b w:val="0"/>
+                <w:sz w:val="18"/>
+              </w:rPr>
+              <w:t>Futures premium</w:t>
+            </w:r>
+          </w:p>
+        </w:tc>
+        <w:tc>
+          <w:tcPr>
+            <w:tcW w:type="dxa" w:w="4819"/>
+          </w:tcPr>
+          <w:p>
+            <w:r>
+              <w:rPr>
+                <w:b w:val="0"/>
+                <w:sz w:val="18"/>
+              </w:rPr>
+              <w:t>Futures minus spot: the basis with its sign flipped. It is the gross gain of a cash-and-carry.</w:t>
             </w:r>
           </w:p>
         </w:tc>
@@ -2661,7 +2691,7 @@
                 <w:b w:val="0"/>
                 <w:sz w:val="18"/>
               </w:rPr>
-              <w:t>Basis</w:t>
+              <w:t>Basis (spot - futures)</w:t>
             </w:r>
           </w:p>
         </w:tc>
@@ -2675,7 +2705,7 @@
                 <w:b w:val="0"/>
                 <w:sz w:val="18"/>
               </w:rPr>
-              <w:t>Futures minus spot, in Rs and %</w:t>
+              <w:t>Spot minus futures, in Rs and %, and whether futures are above or below spot</w:t>
             </w:r>
           </w:p>
         </w:tc>
@@ -2689,7 +2719,7 @@
                 <w:b w:val="0"/>
                 <w:sz w:val="18"/>
               </w:rPr>
-              <w:t>futures - spot</w:t>
+              <w:t>spot - futures</w:t>
             </w:r>
           </w:p>
         </w:tc>
@@ -2703,7 +2733,7 @@
                 <w:b w:val="0"/>
                 <w:sz w:val="18"/>
               </w:rPr>
-              <w:t>+Rs 204.00, +0.83%</w:t>
+              <w:t>-Rs 204.00, -0.83%; futures above spot</w:t>
             </w:r>
           </w:p>
         </w:tc>
@@ -3063,7 +3093,7 @@
       <w:r>
         <w:drawing>
           <wp:inline xmlns:a="http://schemas.openxmlformats.org/drawingml/2006/main" xmlns:pic="http://schemas.openxmlformats.org/drawingml/2006/picture">
-            <wp:extent cx="6120000" cy="4529719"/>
+            <wp:extent cx="6120000" cy="4604353"/>
             <wp:docPr id="1" name="Picture 1"/>
             <wp:cNvGraphicFramePr>
               <a:graphicFrameLocks noChangeAspect="1"/>
@@ -3084,7 +3114,7 @@
                   <pic:spPr>
                     <a:xfrm>
                       <a:off x="0" y="0"/>
-                      <a:ext cx="6120000" cy="4529719"/>
+                      <a:ext cx="6120000" cy="4604353"/>
                     </a:xfrm>
                     <a:prstGeom prst="rect"/>
                   </pic:spPr>
@@ -3108,7 +3138,7 @@
       <w:r>
         <w:drawing>
           <wp:inline xmlns:a="http://schemas.openxmlformats.org/drawingml/2006/main" xmlns:pic="http://schemas.openxmlformats.org/drawingml/2006/picture">
-            <wp:extent cx="6120000" cy="4529719"/>
+            <wp:extent cx="6120000" cy="4604353"/>
             <wp:docPr id="2" name="Picture 2"/>
             <wp:cNvGraphicFramePr>
               <a:graphicFrameLocks noChangeAspect="1"/>
@@ -3129,7 +3159,7 @@
                   <pic:spPr>
                     <a:xfrm>
                       <a:off x="0" y="0"/>
-                      <a:ext cx="6120000" cy="4529719"/>
+                      <a:ext cx="6120000" cy="4604353"/>
                     </a:xfrm>
                     <a:prstGeom prst="rect"/>
                   </pic:spPr>
@@ -3218,7 +3248,7 @@
         <w:t>What it shows:</w:t>
       </w:r>
       <w:r>
-        <w:t xml:space="preserve"> average basis % by days-to-expiry bucket, from 46-60 days out down to 0-5 days.</w:t>
+        <w:t xml:space="preserve"> average basis % (spot minus futures) by days-to-expiry bucket, from 46-60 days out down to 0-5 days. Bars below zero mean futures above spot.</w:t>
       </w:r>
     </w:p>
     <w:p>
@@ -3280,7 +3310,7 @@
         <w:t>What you can infer:</w:t>
       </w:r>
       <w:r>
-        <w:t xml:space="preserve"> a contract loses its premium as delivery nears. Jeera: +2.03% at 46-60 days, -0.53% at 6-10 days, while the curve slopes up 1.39% a month. Enter cash-and-carry early.</w:t>
+        <w:t xml:space="preserve"> a contract loses its premium as delivery nears. Jeera's basis averages -2.03% at 46-60 days (futures 2.03% above spot) and +0.53% at 6-10 days (futures below spot), while the curve slopes up 1.39% a month. Enter cash-and-carry early.</w:t>
       </w:r>
     </w:p>
     <w:p>
@@ -3723,7 +3753,7 @@
         <w:pStyle w:val="ListBullet2"/>
       </w:pPr>
       <w:r>
-        <w:t>Cash-and-carry: gross = futures - spot. Subtract storage (rate x days), assaying, handling, exchange fee, SEBI fee, brokerage, GST on fees. That gives carry profit before funding. Holding-period return = carry profit / spot. Annualised = that x 365 / days. Then subtract funding (spot x (T-bill + spread) x days / 365) to get net profit.</w:t>
+        <w:t>Cash-and-carry: gross = futures premium = futures - spot (the basis with its sign flipped). Subtract storage (rate x days), assaying, handling, exchange fee, SEBI fee, brokerage, GST on fees. That gives carry profit before funding. Holding-period return = carry profit / spot. Annualised = that x 365 / days. Then subtract funding (spot x (T-bill + spread) x days / 365) to get net profit.</w:t>
       </w:r>
     </w:p>
     <w:p>
@@ -3731,7 +3761,7 @@
         <w:pStyle w:val="ListBullet2"/>
       </w:pPr>
       <w:r>
-        <w:t>Reverse arb: price gap = spot - futures. Add the funding and storage avoided. Subtract exchange fee, SEBI fee, brokerage, GST on fees and stamp duty. That gives net benefit. Holding-period and annualised return are worked out the same way.</w:t>
+        <w:t>Reverse arb: start from the basis = spot - futures. Add the funding and storage avoided. Subtract exchange fee, SEBI fee, brokerage, GST on fees and stamp duty. That gives net benefit. Holding-period and annualised return are worked out the same way.</w:t>
       </w:r>
     </w:p>
     <w:p>
@@ -3762,7 +3792,7 @@
         <w:t>What you can infer:</w:t>
       </w:r>
       <w:r>
-        <w:t xml:space="preserve"> exactly where the money goes on any day. On 9 Oct 2026 jeera's Rs 204.00 basis leaves Rs 122.11 before funding and Rs 77.75 after.</w:t>
+        <w:t xml:space="preserve"> exactly where the money goes on any day. On 9 Oct 2026 jeera's basis was -Rs 204.00, a futures premium of Rs 204.00. That leaves Rs 122.11 before funding and Rs 77.75 after.</w:t>
       </w:r>
     </w:p>
     <w:p>
@@ -3812,7 +3842,7 @@
         <w:t>What it shows:</w:t>
       </w:r>
       <w:r>
-        <w:t xml:space="preserve"> one chart for the period. Each trading day is a marker on the basis line: teal up-triangle for cash-and-carry, orange down-triangle for reverse arb, grey square for no trade. Bigger markers earned more a year. The top 5 dates of each side are labelled with date and return. A dashed line marks the date in the calculator.</w:t>
+        <w:t xml:space="preserve"> one chart for the period. Each trading day is a marker on the basis line (spot minus futures, so cash-and-carry days sit below zero and reverse-arb days above): teal up-triangle for cash-and-carry, orange down-triangle for reverse arb, grey square for no trade. Bigger markers earned more a year. The top 5 dates of each side are labelled with date and return. A dashed line marks the date in the calculator.</w:t>
       </w:r>
     </w:p>
     <w:p>
@@ -4114,7 +4144,7 @@
       <w:r>
         <w:drawing>
           <wp:inline xmlns:a="http://schemas.openxmlformats.org/drawingml/2006/main" xmlns:pic="http://schemas.openxmlformats.org/drawingml/2006/picture">
-            <wp:extent cx="6120000" cy="4610094"/>
+            <wp:extent cx="6120000" cy="4753621"/>
             <wp:docPr id="6" name="Picture 6"/>
             <wp:cNvGraphicFramePr>
               <a:graphicFrameLocks noChangeAspect="1"/>
@@ -4135,7 +4165,7 @@
                   <pic:spPr>
                     <a:xfrm>
                       <a:off x="0" y="0"/>
-                      <a:ext cx="6120000" cy="4610094"/>
+                      <a:ext cx="6120000" cy="4753621"/>
                     </a:xfrm>
                     <a:prstGeom prst="rect"/>
                   </pic:spPr>
@@ -4159,7 +4189,7 @@
       <w:r>
         <w:drawing>
           <wp:inline xmlns:a="http://schemas.openxmlformats.org/drawingml/2006/main" xmlns:pic="http://schemas.openxmlformats.org/drawingml/2006/picture">
-            <wp:extent cx="6120000" cy="4604353"/>
+            <wp:extent cx="6120000" cy="4753621"/>
             <wp:docPr id="7" name="Picture 7"/>
             <wp:cNvGraphicFramePr>
               <a:graphicFrameLocks noChangeAspect="1"/>
@@ -4180,7 +4210,7 @@
                   <pic:spPr>
                     <a:xfrm>
                       <a:off x="0" y="0"/>
-                      <a:ext cx="6120000" cy="4604353"/>
+                      <a:ext cx="6120000" cy="4753621"/>
                     </a:xfrm>
                     <a:prstGeom prst="rect"/>
                   </pic:spPr>
@@ -4287,7 +4317,7 @@
         <w:t>How calculated:</w:t>
       </w:r>
       <w:r>
-        <w:t xml:space="preserve"> basis = futures - spot; basis % = basis / spot x 100.</w:t>
+        <w:t xml:space="preserve"> basis = spot - futures; basis % = basis / spot x 100. Negative means futures above spot.</w:t>
       </w:r>
     </w:p>
     <w:p>
@@ -4301,7 +4331,7 @@
         <w:t>What you can infer:</w:t>
       </w:r>
       <w:r>
-        <w:t xml:space="preserve"> futures closed above spot on 61% of days for jeera; the basis ranged from -3.70% to +6.86% and averaged +0.45%.</w:t>
+        <w:t xml:space="preserve"> futures closed above spot on 61% of days for jeera; the basis ranged from -6.86% to +3.70% and averaged -0.45%.</w:t>
       </w:r>
     </w:p>
     <w:p>
@@ -4403,7 +4433,7 @@
         <w:t>What you can infer:</w:t>
       </w:r>
       <w:r>
-        <w:t xml:space="preserve"> the latest jeera basis, +0.83%, is higher than on 59% of days. Half of all days fell between -0.51% and +1.40%. It is ordinary, not extreme.</w:t>
+        <w:t xml:space="preserve"> the latest jeera basis, -0.83%, is higher than on 41% of days. Half of all days fell between -1.40% and +0.51%. It is ordinary, not extreme. Left of zero, futures are above spot; right of zero, below.</w:t>
       </w:r>
     </w:p>
     <w:p>
@@ -4431,7 +4461,7 @@
         <w:t>Likely question:</w:t>
       </w:r>
       <w:r>
-        <w:t xml:space="preserve"> "Is a 0.83% basis attractive?" On its own, no. It has to be compared with the cost of carry for the days left, which is what the next tab does.</w:t>
+        <w:t xml:space="preserve"> "Is a basis of -0.83% attractive?" On its own, no. It has to be compared with the cost of carry for the days left, which is what the next tab does.</w:t>
       </w:r>
     </w:p>
     <w:p>
@@ -4459,7 +4489,7 @@
       <w:r>
         <w:drawing>
           <wp:inline xmlns:a="http://schemas.openxmlformats.org/drawingml/2006/main" xmlns:pic="http://schemas.openxmlformats.org/drawingml/2006/picture">
-            <wp:extent cx="6120000" cy="6877824"/>
+            <wp:extent cx="6120000" cy="6952457"/>
             <wp:docPr id="8" name="Picture 8"/>
             <wp:cNvGraphicFramePr>
               <a:graphicFrameLocks noChangeAspect="1"/>
@@ -4480,7 +4510,7 @@
                   <pic:spPr>
                     <a:xfrm>
                       <a:off x="0" y="0"/>
-                      <a:ext cx="6120000" cy="6877824"/>
+                      <a:ext cx="6120000" cy="6952457"/>
                     </a:xfrm>
                     <a:prstGeom prst="rect"/>
                   </pic:spPr>
@@ -4504,7 +4534,7 @@
       <w:r>
         <w:drawing>
           <wp:inline xmlns:a="http://schemas.openxmlformats.org/drawingml/2006/main" xmlns:pic="http://schemas.openxmlformats.org/drawingml/2006/picture">
-            <wp:extent cx="6120000" cy="6877824"/>
+            <wp:extent cx="6120000" cy="6946717"/>
             <wp:docPr id="9" name="Picture 9"/>
             <wp:cNvGraphicFramePr>
               <a:graphicFrameLocks noChangeAspect="1"/>
@@ -4525,7 +4555,7 @@
                   <pic:spPr>
                     <a:xfrm>
                       <a:off x="0" y="0"/>
-                      <a:ext cx="6120000" cy="6877824"/>
+                      <a:ext cx="6120000" cy="6946717"/>
                     </a:xfrm>
                     <a:prstGeom prst="rect"/>
                   </pic:spPr>
@@ -4817,7 +4847,7 @@
         <w:t>What it shows:</w:t>
       </w:r>
       <w:r>
-        <w:t xml:space="preserve"> the latest day's cash-and-carry per quintal: gross basis, then each cost, then net profit.</w:t>
+        <w:t xml:space="preserve"> the latest day's cash-and-carry per quintal: the futures premium (futures minus spot), then each cost, then net profit.</w:t>
       </w:r>
     </w:p>
     <w:p>
@@ -4859,7 +4889,7 @@
         <w:t>What you can infer:</w:t>
       </w:r>
       <w:r>
-        <w:t xml:space="preserve"> on 9 Oct 2026 jeera's +Rs 204.00 gross loses Rs 126.25 to costs. Assaying (Rs 50.00 before GST) is the largest, then funding (Rs 44.36). Net +Rs 77.75 per quintal, or +Rs 2,332 per 3 MT lot.</w:t>
+        <w:t xml:space="preserve"> on 9 Oct 2026 jeera's +Rs 204.00 futures premium loses Rs 126.25 to costs. Assaying (Rs 50.00 before GST) is the largest, then funding (Rs 44.36). Net +Rs 77.75 per quintal, or +Rs 2,332 per 3 MT lot.</w:t>
       </w:r>
     </w:p>
     <w:p>
@@ -4947,7 +4977,7 @@
         <w:t>How calculated:</w:t>
       </w:r>
       <w:r>
-        <w:t xml:space="preserve"> (gross basis - all costs other than storage) / (days x GST multiplier).</w:t>
+        <w:t xml:space="preserve"> (futures premium - all costs other than storage) / (days x GST multiplier).</w:t>
       </w:r>
     </w:p>
     <w:p>
@@ -4989,7 +5019,7 @@
         <w:t>Likely question:</w:t>
       </w:r>
       <w:r>
-        <w:t xml:space="preserve"> "How sensitive is the trade to warehouse rent?" Hardly at all. Rent is Rs 0.70 a day on a Rs 24,600 commodity. The basis and the one-off costs decide the trade.</w:t>
+        <w:t xml:space="preserve"> "How sensitive is the trade to warehouse rent?" Hardly at all. Rent is Rs 0.70 a day on a Rs 24,600 commodity. The futures premium and the one-off costs decide the trade.</w:t>
       </w:r>
     </w:p>
     <w:p>
@@ -5605,7 +5635,7 @@
       <w:r>
         <w:drawing>
           <wp:inline xmlns:a="http://schemas.openxmlformats.org/drawingml/2006/main" xmlns:pic="http://schemas.openxmlformats.org/drawingml/2006/picture">
-            <wp:extent cx="6120000" cy="4793809"/>
+            <wp:extent cx="6120000" cy="4868443"/>
             <wp:docPr id="12" name="Picture 12"/>
             <wp:cNvGraphicFramePr>
               <a:graphicFrameLocks noChangeAspect="1"/>
@@ -5626,7 +5656,7 @@
                   <pic:spPr>
                     <a:xfrm>
                       <a:off x="0" y="0"/>
-                      <a:ext cx="6120000" cy="4793809"/>
+                      <a:ext cx="6120000" cy="4868443"/>
                     </a:xfrm>
                     <a:prstGeom prst="rect"/>
                   </pic:spPr>
@@ -5650,7 +5680,7 @@
       <w:r>
         <w:drawing>
           <wp:inline xmlns:a="http://schemas.openxmlformats.org/drawingml/2006/main" xmlns:pic="http://schemas.openxmlformats.org/drawingml/2006/picture">
-            <wp:extent cx="6120000" cy="4788068"/>
+            <wp:extent cx="6120000" cy="4862702"/>
             <wp:docPr id="13" name="Picture 13"/>
             <wp:cNvGraphicFramePr>
               <a:graphicFrameLocks noChangeAspect="1"/>
@@ -5671,7 +5701,7 @@
                   <pic:spPr>
                     <a:xfrm>
                       <a:off x="0" y="0"/>
-                      <a:ext cx="6120000" cy="4788068"/>
+                      <a:ext cx="6120000" cy="4862702"/>
                     </a:xfrm>
                     <a:prstGeom prst="rect"/>
                   </pic:spPr>
@@ -5701,7 +5731,7 @@
     </w:p>
     <w:p>
       <w:r>
-        <w:t>The same chart as Finding 1 on the Overview, for the selected date range. Its takeaway adds how many expiries had a negative average basis in their last 10 days: 8 of 12 for jeera.</w:t>
+        <w:t>The same chart as Finding 1 on the Overview, for the selected date range. Its takeaway adds how many expiries had a positive average basis (futures below spot) in their last 10 days: 8 of 12 for jeera.</w:t>
       </w:r>
     </w:p>
     <w:p>
@@ -5785,7 +5815,7 @@
         <w:t>What you can infer:</w:t>
       </w:r>
       <w:r>
-        <w:t xml:space="preserve"> paths differ by a few percent, but most drift down towards and through spot.</w:t>
+        <w:t xml:space="preserve"> paths differ by a few percent, but most drift up through zero: futures start above spot (negative basis) and end below it (positive basis).</w:t>
       </w:r>
     </w:p>
     <w:p>
@@ -6159,7 +6189,7 @@
         <w:t>What you can infer:</w:t>
       </w:r>
       <w:r>
-        <w:t xml:space="preserve"> jeera's next month traded Rs 406 per quintal above the expiring one on average. A long pays this to roll; a stock holder earns it by selling the next month.</w:t>
+        <w:t xml:space="preserve"> jeera's next month traded Rs 406 per quintal above the expiring one on average (this is a spread between two futures, not the basis). A long pays this to roll; a stock holder earns it by selling the next month.</w:t>
       </w:r>
     </w:p>
     <w:p>
@@ -6484,7 +6514,7 @@
       <w:r>
         <w:drawing>
           <wp:inline xmlns:a="http://schemas.openxmlformats.org/drawingml/2006/main" xmlns:pic="http://schemas.openxmlformats.org/drawingml/2006/picture">
-            <wp:extent cx="6120000" cy="6263527"/>
+            <wp:extent cx="6120000" cy="6418537"/>
             <wp:docPr id="16" name="Picture 16"/>
             <wp:cNvGraphicFramePr>
               <a:graphicFrameLocks noChangeAspect="1"/>
@@ -6505,7 +6535,7 @@
                   <pic:spPr>
                     <a:xfrm>
                       <a:off x="0" y="0"/>
-                      <a:ext cx="6120000" cy="6263527"/>
+                      <a:ext cx="6120000" cy="6418537"/>
                     </a:xfrm>
                     <a:prstGeom prst="rect"/>
                   </pic:spPr>
@@ -6529,7 +6559,7 @@
       <w:r>
         <w:drawing>
           <wp:inline xmlns:a="http://schemas.openxmlformats.org/drawingml/2006/main" xmlns:pic="http://schemas.openxmlformats.org/drawingml/2006/picture">
-            <wp:extent cx="6120000" cy="6257786"/>
+            <wp:extent cx="6120000" cy="6418537"/>
             <wp:docPr id="17" name="Picture 17"/>
             <wp:cNvGraphicFramePr>
               <a:graphicFrameLocks noChangeAspect="1"/>
@@ -6550,7 +6580,7 @@
                   <pic:spPr>
                     <a:xfrm>
                       <a:off x="0" y="0"/>
-                      <a:ext cx="6120000" cy="6257786"/>
+                      <a:ext cx="6120000" cy="6418537"/>
                     </a:xfrm>
                     <a:prstGeom prst="rect"/>
                   </pic:spPr>
@@ -6910,7 +6940,7 @@
                 <w:b w:val="0"/>
                 <w:sz w:val="18"/>
               </w:rPr>
-              <w:t>Gross basis</w:t>
+              <w:t>Futures premium (basis is -1,077.10)</w:t>
             </w:r>
           </w:p>
         </w:tc>
@@ -7546,7 +7576,7 @@
                 <w:b w:val="0"/>
                 <w:sz w:val="18"/>
               </w:rPr>
-              <w:t>Price gap</w:t>
+              <w:t>Basis (spot - futures)</w:t>
             </w:r>
           </w:p>
         </w:tc>

</xml_diff>